<commit_message>
22m-share: guide points to the hosted link; status file
Co-Authored-By: Claude Opus 5.5 <noreply@anthropic.com>
Claude-Session: https://claude.ai/code/session_01WenU9YfZxHDgmNpcDVSGAM
</commit_message>
<xml_diff>
--- a/forms/22m-share/دليل-رئيس-الفريق.docx
+++ b/forms/22m-share/دليل-رئيس-الفريق.docx
@@ -121,7 +121,7 @@
           <w:bCs/>
           <w:szCs w:val="32"/>
         </w:rPr>
-        <w:t>أولًا: نشر الصفحة على رابط (مرة واحدة)</w:t>
+        <w:t>أولًا: رابط النموذج</w:t>
       </w:r>
     </w:p>
     <w:p>
@@ -137,7 +137,7 @@
           <w:sz w:val="28"/>
           <w:szCs w:val="28"/>
         </w:rPr>
-        <w:t>أعضاء الفريق يفتحون الصفحة برابط. لذلك ارفع ملف index.html على أي استضافة مجانية، وأسهلها:</w:t>
+        <w:t>افتح النموذج من هذا الرابط، وهو نفسه لكل رؤساء الفرق ولا يحتاج استضافة ولا تنزيل:</w:t>
       </w:r>
     </w:p>
     <w:p>
@@ -149,27 +149,14 @@
       <w:r>
         <w:rPr>
           <w:rFonts w:ascii="Sakkal Majalla" w:hAnsi="Sakkal Majalla" w:cs="Sakkal Majalla" w:eastAsia="Sakkal Majalla"/>
-          <w:b w:val="0"/>
+          <w:b/>
+          <w:color w:val="0D6B63"/>
           <w:sz w:val="28"/>
+          <w:bCs/>
           <w:szCs w:val="28"/>
+          <w:rtl w:val="0"/>
         </w:rPr>
-        <w:t>1) افتح الرابط app.netlify.com/drop بحسابك، وأفلت الملف في المربع. يعطيك رابطًا يبدأ بـ https.</w:t>
-      </w:r>
-    </w:p>
-    <w:p>
-      <w:pPr>
-        <w:spacing w:after="40" w:before="0"/>
-        <w:bidi/>
-        <w:jc w:val="right"/>
-      </w:pPr>
-      <w:r>
-        <w:rPr>
-          <w:rFonts w:ascii="Sakkal Majalla" w:hAnsi="Sakkal Majalla" w:cs="Sakkal Majalla" w:eastAsia="Sakkal Majalla"/>
-          <w:b w:val="0"/>
-          <w:sz w:val="28"/>
-          <w:szCs w:val="28"/>
-        </w:rPr>
-        <w:t>2) أو ارفع الملف على GitHub Pages إن كنت تستخدمه (docs.github.com/pages).</w:t>
+        <w:t>https://ali-alahmari.github.io/forms/22m-share/</w:t>
       </w:r>
     </w:p>
     <w:p>
@@ -185,7 +172,7 @@
           <w:sz w:val="28"/>
           <w:szCs w:val="28"/>
         </w:rPr>
-        <w:t>3) احفظ الرابط. هذا هو رابط النموذج الذي ستشاركه مع الفريق، ولا تفتح الملف من جهازك مباشرة لأن روابط الأعضاء لا تعمل منه.</w:t>
+        <w:t>افتحه من Chrome، ويفضَّل أن تحفظه في المفضلة. لا تُرسل هذا الرابط للأعضاء، فلكل عضو رابط شخصي يظهر لك بعد الربط.</w:t>
       </w:r>
     </w:p>
     <w:p>
@@ -203,7 +190,7 @@
           <w:bCs/>
           <w:szCs w:val="32"/>
         </w:rPr>
-        <w:t>ثانيًا: ربط الجدول (نحو 5 دقائق)</w:t>
+        <w:t>ثانيًا: ربط الجدول في حسابك (نحو 5 دقائق)</w:t>
       </w:r>
     </w:p>
     <w:p>
@@ -449,7 +436,7 @@
           <w:sz w:val="26"/>
           <w:szCs w:val="26"/>
         </w:rPr>
-        <w:t>script.new : محرر Apps Script جديد</w:t>
+        <w:t>رابط النموذج: ali-alahmari.github.io/forms/22m-share</w:t>
       </w:r>
     </w:p>
     <w:p>
@@ -465,23 +452,7 @@
           <w:sz w:val="26"/>
           <w:szCs w:val="26"/>
         </w:rPr>
-        <w:t>app.netlify.com/drop : رفع الملف للحصول على رابط</w:t>
-      </w:r>
-    </w:p>
-    <w:p>
-      <w:pPr>
-        <w:spacing w:after="20" w:before="0"/>
-        <w:bidi/>
-        <w:jc w:val="right"/>
-      </w:pPr>
-      <w:r>
-        <w:rPr>
-          <w:rFonts w:ascii="Sakkal Majalla" w:hAnsi="Sakkal Majalla" w:cs="Sakkal Majalla" w:eastAsia="Sakkal Majalla"/>
-          <w:b w:val="0"/>
-          <w:sz w:val="26"/>
-          <w:szCs w:val="26"/>
-        </w:rPr>
-        <w:t>sheets.new : جدول Google Sheet (لا تحتاجه إن نفّذت setup)</w:t>
+        <w:t>محرر Apps Script جديد: script.new</w:t>
       </w:r>
     </w:p>
     <w:p>

</xml_diff>

<commit_message>
22m-share: welcome message, guard text-check fix, illustrated guide
Co-Authored-By: Claude Opus 5.5 <noreply@anthropic.com>
Claude-Session: https://claude.ai/code/session_01WenU9YfZxHDgmNpcDVSGAM
</commit_message>
<xml_diff>
--- a/forms/22m-share/دليل-رئيس-الفريق.docx
+++ b/forms/22m-share/دليل-رئيس-الفريق.docx
@@ -17,7 +17,7 @@
           <w:bCs/>
           <w:szCs w:val="48"/>
         </w:rPr>
-        <w:t>دليل رئيس الفريق</w:t>
+        <w:t>دليل رئيس الفريق المصوّر</w:t>
       </w:r>
     </w:p>
     <w:p>
@@ -69,12 +69,12 @@
           <w:sz w:val="24"/>
           <w:szCs w:val="24"/>
         </w:rPr>
-        <w:t>جميع حقوق الملكية الفكرية محفوظة — لا يجوز التعديل أو إعادة النشر دون إذن كتابي</w:t>
+        <w:t>جميع الحقوق محفوظة 2026، ولا يجوز تعديل النموذج دون إذن كتابي من المُعِدّ.</w:t>
       </w:r>
     </w:p>
     <w:p>
       <w:pPr>
-        <w:spacing w:after="40" w:before="120"/>
+        <w:spacing w:after="60" w:before="200"/>
         <w:bidi/>
         <w:jc w:val="right"/>
       </w:pPr>
@@ -83,11 +83,43 @@
           <w:rFonts w:ascii="Sakkal Majalla" w:hAnsi="Sakkal Majalla" w:cs="Sakkal Majalla" w:eastAsia="Sakkal Majalla"/>
           <w:b/>
           <w:color w:val="0D6B63"/>
-          <w:sz w:val="32"/>
+          <w:sz w:val="34"/>
           <w:bCs/>
-          <w:szCs w:val="32"/>
+          <w:szCs w:val="34"/>
         </w:rPr>
-        <w:t>ما الذي يحدث لبياناتك؟</w:t>
+        <w:t>قبل أن تبدأ</w:t>
+      </w:r>
+    </w:p>
+    <w:p>
+      <w:pPr>
+        <w:spacing w:after="60" w:before="0"/>
+        <w:bidi/>
+        <w:jc w:val="right"/>
+      </w:pPr>
+      <w:r>
+        <w:rPr>
+          <w:rFonts w:ascii="Sakkal Majalla" w:hAnsi="Sakkal Majalla" w:cs="Sakkal Majalla" w:eastAsia="Sakkal Majalla"/>
+          <w:b w:val="0"/>
+          <w:sz w:val="28"/>
+          <w:szCs w:val="28"/>
+        </w:rPr>
+        <w:t>كل بياناتك تُحفظ في حسابك أنت في Google: جدول تعبئة الفريق، ومجلد شواهد المنشآت. لا يمر شيء منها عبر حساب المُعِدّ ولا يراه.</w:t>
+      </w:r>
+    </w:p>
+    <w:p>
+      <w:pPr>
+        <w:spacing w:after="60" w:before="0"/>
+        <w:bidi/>
+        <w:jc w:val="right"/>
+      </w:pPr>
+      <w:r>
+        <w:rPr>
+          <w:rFonts w:ascii="Sakkal Majalla" w:hAnsi="Sakkal Majalla" w:cs="Sakkal Majalla" w:eastAsia="Sakkal Majalla"/>
+          <w:b w:val="0"/>
+          <w:sz w:val="28"/>
+          <w:szCs w:val="28"/>
+        </w:rPr>
+        <w:t>تحتاج حساب Google وجهاز حاسب لخطوات الإعداد الأولى، وتستغرق نحو 10 دقائق مرة واحدة. بعدها يعمل النموذج من الجوال أو الحاسب.</w:t>
       </w:r>
     </w:p>
     <w:p>
@@ -103,12 +135,12 @@
           <w:sz w:val="28"/>
           <w:szCs w:val="28"/>
         </w:rPr>
-        <w:t>كل شيء يُحفظ في حسابك أنت في Google: جدول بيانات الفريق ومجلد شواهد المنشآت. لا يمر شيء عبر حساب المُعِدّ ولا يراه. النموذج نفسه ملف جاهز لا يحتاج تعديلًا، ويظهر في أعلى صفحته اسم المُعِدّ وحقوق الملكية، ولا يعمل إن عُدِّل الملف.</w:t>
+        <w:t>الصور المأخوذة من النموذج حقيقية. أما صور محرر Google فهي رسوم توضيحية مبسطة، وقد تظهر لك الأزرار بالعربية أو الإنجليزية حسب لغة حسابك.</w:t>
       </w:r>
     </w:p>
     <w:p>
       <w:pPr>
-        <w:spacing w:after="40" w:before="120"/>
+        <w:spacing w:after="60" w:before="200"/>
         <w:bidi/>
         <w:jc w:val="right"/>
       </w:pPr>
@@ -117,16 +149,16 @@
           <w:rFonts w:ascii="Sakkal Majalla" w:hAnsi="Sakkal Majalla" w:cs="Sakkal Majalla" w:eastAsia="Sakkal Majalla"/>
           <w:b/>
           <w:color w:val="0D6B63"/>
-          <w:sz w:val="32"/>
+          <w:sz w:val="34"/>
           <w:bCs/>
-          <w:szCs w:val="32"/>
+          <w:szCs w:val="34"/>
         </w:rPr>
-        <w:t>أولًا: رابط النموذج</w:t>
+        <w:t>الخطوة 1: فتح النموذج</w:t>
       </w:r>
     </w:p>
     <w:p>
       <w:pPr>
-        <w:spacing w:after="40" w:before="0"/>
+        <w:spacing w:after="60" w:before="0"/>
         <w:bidi/>
         <w:jc w:val="right"/>
       </w:pPr>
@@ -137,12 +169,12 @@
           <w:sz w:val="28"/>
           <w:szCs w:val="28"/>
         </w:rPr>
-        <w:t>افتح النموذج من هذا الرابط، وهو نفسه لكل رؤساء الفرق ولا يحتاج استضافة ولا تنزيل:</w:t>
+        <w:t>افتح الرابط التالي من متصفح Chrome، واحفظه في المفضلة:</w:t>
       </w:r>
     </w:p>
     <w:p>
       <w:pPr>
-        <w:spacing w:after="40" w:before="0"/>
+        <w:spacing w:after="80" w:before="0"/>
         <w:bidi/>
         <w:jc w:val="right"/>
       </w:pPr>
@@ -161,7 +193,7 @@
     </w:p>
     <w:p>
       <w:pPr>
-        <w:spacing w:after="120" w:before="0"/>
+        <w:spacing w:after="60" w:before="0"/>
         <w:bidi/>
         <w:jc w:val="right"/>
       </w:pPr>
@@ -172,12 +204,126 @@
           <w:sz w:val="28"/>
           <w:szCs w:val="28"/>
         </w:rPr>
-        <w:t>افتحه من Chrome، ويفضَّل أن تحفظه في المفضلة. لا تُرسل هذا الرابط للأعضاء، فلكل عضو رابط شخصي يظهر لك بعد الربط.</w:t>
+        <w:t>أول مرة تظهر لك رسالة ترحيب، ثم دليل الاستخدام داخل النموذج.</w:t>
       </w:r>
     </w:p>
     <w:p>
       <w:pPr>
-        <w:spacing w:after="40" w:before="120"/>
+        <w:spacing w:after="40"/>
+        <w:jc w:val="center"/>
+      </w:pPr>
+      <w:r>
+        <w:drawing>
+          <wp:inline xmlns:a="http://schemas.openxmlformats.org/drawingml/2006/main" xmlns:pic="http://schemas.openxmlformats.org/drawingml/2006/picture">
+            <wp:extent cx="3960000" cy="2330308"/>
+            <wp:docPr id="1" name="Picture 1"/>
+            <wp:cNvGraphicFramePr>
+              <a:graphicFrameLocks noChangeAspect="1"/>
+            </wp:cNvGraphicFramePr>
+            <a:graphic>
+              <a:graphicData uri="http://schemas.openxmlformats.org/drawingml/2006/picture">
+                <pic:pic>
+                  <pic:nvPicPr>
+                    <pic:cNvPr id="0" name="01-welcome.png"/>
+                    <pic:cNvPicPr/>
+                  </pic:nvPicPr>
+                  <pic:blipFill>
+                    <a:blip r:embed="rId9"/>
+                    <a:stretch>
+                      <a:fillRect/>
+                    </a:stretch>
+                  </pic:blipFill>
+                  <pic:spPr>
+                    <a:xfrm>
+                      <a:off x="0" y="0"/>
+                      <a:ext cx="3960000" cy="2330308"/>
+                    </a:xfrm>
+                    <a:prstGeom prst="rect"/>
+                  </pic:spPr>
+                </pic:pic>
+              </a:graphicData>
+            </a:graphic>
+          </wp:inline>
+        </w:drawing>
+      </w:r>
+    </w:p>
+    <w:p>
+      <w:pPr>
+        <w:spacing w:after="160" w:before="0"/>
+        <w:bidi/>
+        <w:jc w:val="center"/>
+      </w:pPr>
+      <w:r>
+        <w:rPr>
+          <w:rFonts w:ascii="Sakkal Majalla" w:hAnsi="Sakkal Majalla" w:cs="Sakkal Majalla" w:eastAsia="Sakkal Majalla"/>
+          <w:b w:val="0"/>
+          <w:color w:val="666666"/>
+          <w:sz w:val="24"/>
+          <w:szCs w:val="24"/>
+        </w:rPr>
+        <w:t>رسالة الترحيب عند أول فتح</w:t>
+      </w:r>
+    </w:p>
+    <w:p>
+      <w:pPr>
+        <w:spacing w:after="40"/>
+        <w:jc w:val="center"/>
+      </w:pPr>
+      <w:r>
+        <w:drawing>
+          <wp:inline xmlns:a="http://schemas.openxmlformats.org/drawingml/2006/main" xmlns:pic="http://schemas.openxmlformats.org/drawingml/2006/picture">
+            <wp:extent cx="4320000" cy="2229677"/>
+            <wp:docPr id="2" name="Picture 2"/>
+            <wp:cNvGraphicFramePr>
+              <a:graphicFrameLocks noChangeAspect="1"/>
+            </wp:cNvGraphicFramePr>
+            <a:graphic>
+              <a:graphicData uri="http://schemas.openxmlformats.org/drawingml/2006/picture">
+                <pic:pic>
+                  <pic:nvPicPr>
+                    <pic:cNvPr id="0" name="02-guide.png"/>
+                    <pic:cNvPicPr/>
+                  </pic:nvPicPr>
+                  <pic:blipFill>
+                    <a:blip r:embed="rId10"/>
+                    <a:stretch>
+                      <a:fillRect/>
+                    </a:stretch>
+                  </pic:blipFill>
+                  <pic:spPr>
+                    <a:xfrm>
+                      <a:off x="0" y="0"/>
+                      <a:ext cx="4320000" cy="2229677"/>
+                    </a:xfrm>
+                    <a:prstGeom prst="rect"/>
+                  </pic:spPr>
+                </pic:pic>
+              </a:graphicData>
+            </a:graphic>
+          </wp:inline>
+        </w:drawing>
+      </w:r>
+    </w:p>
+    <w:p>
+      <w:pPr>
+        <w:spacing w:after="160" w:before="0"/>
+        <w:bidi/>
+        <w:jc w:val="center"/>
+      </w:pPr>
+      <w:r>
+        <w:rPr>
+          <w:rFonts w:ascii="Sakkal Majalla" w:hAnsi="Sakkal Majalla" w:cs="Sakkal Majalla" w:eastAsia="Sakkal Majalla"/>
+          <w:b w:val="0"/>
+          <w:color w:val="666666"/>
+          <w:sz w:val="24"/>
+          <w:szCs w:val="24"/>
+        </w:rPr>
+        <w:t>دليل الاستخدام داخل النموذج، ويمكن فتحه لاحقًا من زر «دليل الاستخدام»</w:t>
+      </w:r>
+    </w:p>
+    <w:p>
+      <w:pPr>
+        <w:spacing w:after="60" w:before="200"/>
         <w:bidi/>
         <w:jc w:val="right"/>
       </w:pPr>
@@ -186,16 +332,16 @@
           <w:rFonts w:ascii="Sakkal Majalla" w:hAnsi="Sakkal Majalla" w:cs="Sakkal Majalla" w:eastAsia="Sakkal Majalla"/>
           <w:b/>
           <w:color w:val="0D6B63"/>
-          <w:sz w:val="32"/>
+          <w:sz w:val="34"/>
           <w:bCs/>
-          <w:szCs w:val="32"/>
+          <w:szCs w:val="34"/>
         </w:rPr>
-        <w:t>ثانيًا: ربط الجدول في حسابك (نحو 5 دقائق)</w:t>
+        <w:t>الخطوة 2: كتابة أسماء الفريق</w:t>
       </w:r>
     </w:p>
     <w:p>
       <w:pPr>
-        <w:spacing w:after="40" w:before="0"/>
+        <w:spacing w:after="60" w:before="0"/>
         <w:bidi/>
         <w:jc w:val="right"/>
       </w:pPr>
@@ -206,12 +352,87 @@
           <w:sz w:val="28"/>
           <w:szCs w:val="28"/>
         </w:rPr>
-        <w:t>1) افتح رابط النموذج، واضغط «مشاركة الفريق». اكتب رمزًا سريًا للفريق إن أردت.</w:t>
+        <w:t>في تبويب «نموذج تقويم المعايير» اكتب اسمك في الخانة الأولى، ثم أسماء الأعضاء. استخدم زر «إضافة عضو» لزيادة الخانات، واختر صفة كل واحد.</w:t>
       </w:r>
     </w:p>
     <w:p>
       <w:pPr>
-        <w:spacing w:after="40" w:before="0"/>
+        <w:spacing w:after="40"/>
+        <w:jc w:val="center"/>
+      </w:pPr>
+      <w:r>
+        <w:drawing>
+          <wp:inline xmlns:a="http://schemas.openxmlformats.org/drawingml/2006/main" xmlns:pic="http://schemas.openxmlformats.org/drawingml/2006/picture">
+            <wp:extent cx="5040000" cy="5149804"/>
+            <wp:docPr id="3" name="Picture 3"/>
+            <wp:cNvGraphicFramePr>
+              <a:graphicFrameLocks noChangeAspect="1"/>
+            </wp:cNvGraphicFramePr>
+            <a:graphic>
+              <a:graphicData uri="http://schemas.openxmlformats.org/drawingml/2006/picture">
+                <pic:pic>
+                  <pic:nvPicPr>
+                    <pic:cNvPr id="0" name="03b-team.png"/>
+                    <pic:cNvPicPr/>
+                  </pic:nvPicPr>
+                  <pic:blipFill>
+                    <a:blip r:embed="rId11"/>
+                    <a:stretch>
+                      <a:fillRect/>
+                    </a:stretch>
+                  </pic:blipFill>
+                  <pic:spPr>
+                    <a:xfrm>
+                      <a:off x="0" y="0"/>
+                      <a:ext cx="5040000" cy="5149804"/>
+                    </a:xfrm>
+                    <a:prstGeom prst="rect"/>
+                  </pic:spPr>
+                </pic:pic>
+              </a:graphicData>
+            </a:graphic>
+          </wp:inline>
+        </w:drawing>
+      </w:r>
+    </w:p>
+    <w:p>
+      <w:pPr>
+        <w:spacing w:after="160" w:before="0"/>
+        <w:bidi/>
+        <w:jc w:val="center"/>
+      </w:pPr>
+      <w:r>
+        <w:rPr>
+          <w:rFonts w:ascii="Sakkal Majalla" w:hAnsi="Sakkal Majalla" w:cs="Sakkal Majalla" w:eastAsia="Sakkal Majalla"/>
+          <w:b w:val="0"/>
+          <w:color w:val="666666"/>
+          <w:sz w:val="24"/>
+          <w:szCs w:val="24"/>
+        </w:rPr>
+        <w:t>خانات أسماء الفريق</w:t>
+      </w:r>
+    </w:p>
+    <w:p>
+      <w:pPr>
+        <w:spacing w:after="60" w:before="200"/>
+        <w:bidi/>
+        <w:jc w:val="right"/>
+      </w:pPr>
+      <w:r>
+        <w:rPr>
+          <w:rFonts w:ascii="Sakkal Majalla" w:hAnsi="Sakkal Majalla" w:cs="Sakkal Majalla" w:eastAsia="Sakkal Majalla"/>
+          <w:b/>
+          <w:color w:val="0D6B63"/>
+          <w:sz w:val="34"/>
+          <w:bCs/>
+          <w:szCs w:val="34"/>
+        </w:rPr>
+        <w:t>الخطوة 3: ربط النموذج بجدول في حسابك</w:t>
+      </w:r>
+    </w:p>
+    <w:p>
+      <w:pPr>
+        <w:spacing w:after="60" w:before="0"/>
         <w:bidi/>
         <w:jc w:val="right"/>
       </w:pPr>
@@ -222,12 +443,69 @@
           <w:sz w:val="28"/>
           <w:szCs w:val="28"/>
         </w:rPr>
-        <w:t>2) افتح script.new بحسابك، واحذف الكود، والصق الكود الظاهر في النافذة (زر «نسخ الكود»)، ثم احفظ.</w:t>
+        <w:t>اضغط زر «مشاركة الفريق» في أعلى النموذج. تظهر نافذة فيها الخطوات وكود جاهز.</w:t>
       </w:r>
     </w:p>
     <w:p>
       <w:pPr>
-        <w:spacing w:after="40" w:before="0"/>
+        <w:spacing w:after="40"/>
+        <w:jc w:val="center"/>
+      </w:pPr>
+      <w:r>
+        <w:drawing>
+          <wp:inline xmlns:a="http://schemas.openxmlformats.org/drawingml/2006/main" xmlns:pic="http://schemas.openxmlformats.org/drawingml/2006/picture">
+            <wp:extent cx="4680000" cy="4877053"/>
+            <wp:docPr id="4" name="Picture 4"/>
+            <wp:cNvGraphicFramePr>
+              <a:graphicFrameLocks noChangeAspect="1"/>
+            </wp:cNvGraphicFramePr>
+            <a:graphic>
+              <a:graphicData uri="http://schemas.openxmlformats.org/drawingml/2006/picture">
+                <pic:pic>
+                  <pic:nvPicPr>
+                    <pic:cNvPr id="0" name="04-share-steps.png"/>
+                    <pic:cNvPicPr/>
+                  </pic:nvPicPr>
+                  <pic:blipFill>
+                    <a:blip r:embed="rId12"/>
+                    <a:stretch>
+                      <a:fillRect/>
+                    </a:stretch>
+                  </pic:blipFill>
+                  <pic:spPr>
+                    <a:xfrm>
+                      <a:off x="0" y="0"/>
+                      <a:ext cx="4680000" cy="4877053"/>
+                    </a:xfrm>
+                    <a:prstGeom prst="rect"/>
+                  </pic:spPr>
+                </pic:pic>
+              </a:graphicData>
+            </a:graphic>
+          </wp:inline>
+        </w:drawing>
+      </w:r>
+    </w:p>
+    <w:p>
+      <w:pPr>
+        <w:spacing w:after="160" w:before="0"/>
+        <w:bidi/>
+        <w:jc w:val="center"/>
+      </w:pPr>
+      <w:r>
+        <w:rPr>
+          <w:rFonts w:ascii="Sakkal Majalla" w:hAnsi="Sakkal Majalla" w:cs="Sakkal Majalla" w:eastAsia="Sakkal Majalla"/>
+          <w:b w:val="0"/>
+          <w:color w:val="666666"/>
+          <w:sz w:val="24"/>
+          <w:szCs w:val="24"/>
+        </w:rPr>
+        <w:t>نافذة مشاركة الفريق: اكتب رمزًا سريًا للفريق إن أردت، ثم اضغط «نسخ الكود»</w:t>
+      </w:r>
+    </w:p>
+    <w:p>
+      <w:pPr>
+        <w:spacing w:after="60" w:before="0"/>
         <w:bidi/>
         <w:jc w:val="right"/>
       </w:pPr>
@@ -238,12 +516,52 @@
           <w:sz w:val="28"/>
           <w:szCs w:val="28"/>
         </w:rPr>
-        <w:t>3) اختر الدالة setup من أعلى المحرر واضغط «تشغيل»، ووافق على الصلاحيات. تنشئ الدالة جدول Google Sheet في حسابك.</w:t>
+        <w:t>افتح في تبويب جديد الرابط script.new، والصق الكود واحفظ، ثم شغّل الدالة setup.</w:t>
       </w:r>
     </w:p>
     <w:p>
       <w:pPr>
-        <w:spacing w:after="40" w:before="0"/>
+        <w:spacing w:after="40"/>
+        <w:jc w:val="center"/>
+      </w:pPr>
+      <w:r>
+        <w:drawing>
+          <wp:inline xmlns:a="http://schemas.openxmlformats.org/drawingml/2006/main" xmlns:pic="http://schemas.openxmlformats.org/drawingml/2006/picture">
+            <wp:extent cx="5580000" cy="2356000"/>
+            <wp:docPr id="5" name="Picture 5"/>
+            <wp:cNvGraphicFramePr>
+              <a:graphicFrameLocks noChangeAspect="1"/>
+            </wp:cNvGraphicFramePr>
+            <a:graphic>
+              <a:graphicData uri="http://schemas.openxmlformats.org/drawingml/2006/picture">
+                <pic:pic>
+                  <pic:nvPicPr>
+                    <pic:cNvPr id="0" name="d1.png"/>
+                    <pic:cNvPicPr/>
+                  </pic:nvPicPr>
+                  <pic:blipFill>
+                    <a:blip r:embed="rId13"/>
+                    <a:stretch>
+                      <a:fillRect/>
+                    </a:stretch>
+                  </pic:blipFill>
+                  <pic:spPr>
+                    <a:xfrm>
+                      <a:off x="0" y="0"/>
+                      <a:ext cx="5580000" cy="2356000"/>
+                    </a:xfrm>
+                    <a:prstGeom prst="rect"/>
+                  </pic:spPr>
+                </pic:pic>
+              </a:graphicData>
+            </a:graphic>
+          </wp:inline>
+        </w:drawing>
+      </w:r>
+    </w:p>
+    <w:p>
+      <w:pPr>
+        <w:spacing w:after="60" w:before="0"/>
         <w:bidi/>
         <w:jc w:val="right"/>
       </w:pPr>
@@ -254,7 +572,625 @@
           <w:sz w:val="28"/>
           <w:szCs w:val="28"/>
         </w:rPr>
-        <w:t>4) اضغط «نشر» ثم «عملية نشر جديدة»، النوع «تطبيق ويب»، تنفيذ باسم «أنا»، الوصول «أي شخص». انسخ الرابط المنتهي بـ exec.</w:t>
+        <w:t>عند أول تشغيل يطلب Google الموافقة على الصلاحيات. هذا طبيعي لأن المشروع في حسابك أنت.</w:t>
+      </w:r>
+    </w:p>
+    <w:p>
+      <w:pPr>
+        <w:spacing w:after="40"/>
+        <w:jc w:val="center"/>
+      </w:pPr>
+      <w:r>
+        <w:drawing>
+          <wp:inline xmlns:a="http://schemas.openxmlformats.org/drawingml/2006/main" xmlns:pic="http://schemas.openxmlformats.org/drawingml/2006/picture">
+            <wp:extent cx="5580000" cy="3013200"/>
+            <wp:docPr id="6" name="Picture 6"/>
+            <wp:cNvGraphicFramePr>
+              <a:graphicFrameLocks noChangeAspect="1"/>
+            </wp:cNvGraphicFramePr>
+            <a:graphic>
+              <a:graphicData uri="http://schemas.openxmlformats.org/drawingml/2006/picture">
+                <pic:pic>
+                  <pic:nvPicPr>
+                    <pic:cNvPr id="0" name="d2.png"/>
+                    <pic:cNvPicPr/>
+                  </pic:nvPicPr>
+                  <pic:blipFill>
+                    <a:blip r:embed="rId14"/>
+                    <a:stretch>
+                      <a:fillRect/>
+                    </a:stretch>
+                  </pic:blipFill>
+                  <pic:spPr>
+                    <a:xfrm>
+                      <a:off x="0" y="0"/>
+                      <a:ext cx="5580000" cy="3013200"/>
+                    </a:xfrm>
+                    <a:prstGeom prst="rect"/>
+                  </pic:spPr>
+                </pic:pic>
+              </a:graphicData>
+            </a:graphic>
+          </wp:inline>
+        </w:drawing>
+      </w:r>
+    </w:p>
+    <w:p>
+      <w:pPr>
+        <w:spacing w:after="60" w:before="0"/>
+        <w:bidi/>
+        <w:jc w:val="right"/>
+      </w:pPr>
+      <w:r>
+        <w:rPr>
+          <w:rFonts w:ascii="Sakkal Majalla" w:hAnsi="Sakkal Majalla" w:cs="Sakkal Majalla" w:eastAsia="Sakkal Majalla"/>
+          <w:b w:val="0"/>
+          <w:sz w:val="28"/>
+          <w:szCs w:val="28"/>
+        </w:rPr>
+        <w:t>بعد نجاح التشغيل اضغط Deploy ثم New deployment، واضبط الخيارات كما في الرسم.</w:t>
+      </w:r>
+    </w:p>
+    <w:p>
+      <w:pPr>
+        <w:spacing w:after="40"/>
+        <w:jc w:val="center"/>
+      </w:pPr>
+      <w:r>
+        <w:drawing>
+          <wp:inline xmlns:a="http://schemas.openxmlformats.org/drawingml/2006/main" xmlns:pic="http://schemas.openxmlformats.org/drawingml/2006/picture">
+            <wp:extent cx="5040000" cy="2385600"/>
+            <wp:docPr id="7" name="Picture 7"/>
+            <wp:cNvGraphicFramePr>
+              <a:graphicFrameLocks noChangeAspect="1"/>
+            </wp:cNvGraphicFramePr>
+            <a:graphic>
+              <a:graphicData uri="http://schemas.openxmlformats.org/drawingml/2006/picture">
+                <pic:pic>
+                  <pic:nvPicPr>
+                    <pic:cNvPr id="0" name="d3.png"/>
+                    <pic:cNvPicPr/>
+                  </pic:nvPicPr>
+                  <pic:blipFill>
+                    <a:blip r:embed="rId15"/>
+                    <a:stretch>
+                      <a:fillRect/>
+                    </a:stretch>
+                  </pic:blipFill>
+                  <pic:spPr>
+                    <a:xfrm>
+                      <a:off x="0" y="0"/>
+                      <a:ext cx="5040000" cy="2385600"/>
+                    </a:xfrm>
+                    <a:prstGeom prst="rect"/>
+                  </pic:spPr>
+                </pic:pic>
+              </a:graphicData>
+            </a:graphic>
+          </wp:inline>
+        </w:drawing>
+      </w:r>
+    </w:p>
+    <w:p>
+      <w:pPr>
+        <w:spacing w:after="40"/>
+        <w:jc w:val="center"/>
+      </w:pPr>
+      <w:r>
+        <w:drawing>
+          <wp:inline xmlns:a="http://schemas.openxmlformats.org/drawingml/2006/main" xmlns:pic="http://schemas.openxmlformats.org/drawingml/2006/picture">
+            <wp:extent cx="5040000" cy="1932000"/>
+            <wp:docPr id="8" name="Picture 8"/>
+            <wp:cNvGraphicFramePr>
+              <a:graphicFrameLocks noChangeAspect="1"/>
+            </wp:cNvGraphicFramePr>
+            <a:graphic>
+              <a:graphicData uri="http://schemas.openxmlformats.org/drawingml/2006/picture">
+                <pic:pic>
+                  <pic:nvPicPr>
+                    <pic:cNvPr id="0" name="d4.png"/>
+                    <pic:cNvPicPr/>
+                  </pic:nvPicPr>
+                  <pic:blipFill>
+                    <a:blip r:embed="rId16"/>
+                    <a:stretch>
+                      <a:fillRect/>
+                    </a:stretch>
+                  </pic:blipFill>
+                  <pic:spPr>
+                    <a:xfrm>
+                      <a:off x="0" y="0"/>
+                      <a:ext cx="5040000" cy="1932000"/>
+                    </a:xfrm>
+                    <a:prstGeom prst="rect"/>
+                  </pic:spPr>
+                </pic:pic>
+              </a:graphicData>
+            </a:graphic>
+          </wp:inline>
+        </w:drawing>
+      </w:r>
+    </w:p>
+    <w:p>
+      <w:pPr>
+        <w:spacing w:after="60" w:before="0"/>
+        <w:bidi/>
+        <w:jc w:val="right"/>
+      </w:pPr>
+      <w:r>
+        <w:rPr>
+          <w:rFonts w:ascii="Sakkal Majalla" w:hAnsi="Sakkal Majalla" w:cs="Sakkal Majalla" w:eastAsia="Sakkal Majalla"/>
+          <w:b w:val="0"/>
+          <w:sz w:val="28"/>
+          <w:szCs w:val="28"/>
+        </w:rPr>
+        <w:t>ارجع إلى نافذة «مشاركة الفريق» في النموذج، والصق الرابط في خانة «رابط تطبيق الويب»، ثم اضغط «اختبار وربط». تظهر عبارة «تم الربط» عند النجاح.</w:t>
+      </w:r>
+    </w:p>
+    <w:p>
+      <w:pPr>
+        <w:spacing w:after="60" w:before="200"/>
+        <w:bidi/>
+        <w:jc w:val="right"/>
+      </w:pPr>
+      <w:r>
+        <w:rPr>
+          <w:rFonts w:ascii="Sakkal Majalla" w:hAnsi="Sakkal Majalla" w:cs="Sakkal Majalla" w:eastAsia="Sakkal Majalla"/>
+          <w:b/>
+          <w:color w:val="0D6B63"/>
+          <w:sz w:val="34"/>
+          <w:bCs/>
+          <w:szCs w:val="34"/>
+        </w:rPr>
+        <w:t>الخطوة 4: إرسال الروابط للفريق</w:t>
+      </w:r>
+    </w:p>
+    <w:p>
+      <w:pPr>
+        <w:spacing w:after="60" w:before="0"/>
+        <w:bidi/>
+        <w:jc w:val="right"/>
+      </w:pPr>
+      <w:r>
+        <w:rPr>
+          <w:rFonts w:ascii="Sakkal Majalla" w:hAnsi="Sakkal Majalla" w:cs="Sakkal Majalla" w:eastAsia="Sakkal Majalla"/>
+          <w:b w:val="0"/>
+          <w:sz w:val="28"/>
+          <w:szCs w:val="28"/>
+        </w:rPr>
+        <w:t>بعد الربط يظهر لكل عضو رابط شخصي يثبّت اسمه. اضغط «نسخ رابطه» وأرسله له.</w:t>
+      </w:r>
+    </w:p>
+    <w:p>
+      <w:pPr>
+        <w:spacing w:after="60" w:before="0"/>
+        <w:bidi/>
+        <w:jc w:val="right"/>
+      </w:pPr>
+      <w:r>
+        <w:rPr>
+          <w:rFonts w:ascii="Sakkal Majalla" w:hAnsi="Sakkal Majalla" w:cs="Sakkal Majalla" w:eastAsia="Sakkal Majalla"/>
+          <w:b w:val="0"/>
+          <w:sz w:val="28"/>
+          <w:szCs w:val="28"/>
+        </w:rPr>
+        <w:t>احتفظ بـ«رابط الرئيس» لنفسك ولا ترسله لأحد، فهو الذي يفتح لك النموذج بصلاحية الرئيس من أي جهاز.</w:t>
+      </w:r>
+    </w:p>
+    <w:p>
+      <w:pPr>
+        <w:spacing w:after="40"/>
+        <w:jc w:val="center"/>
+      </w:pPr>
+      <w:r>
+        <w:drawing>
+          <wp:inline xmlns:a="http://schemas.openxmlformats.org/drawingml/2006/main" xmlns:pic="http://schemas.openxmlformats.org/drawingml/2006/picture">
+            <wp:extent cx="4680000" cy="4877053"/>
+            <wp:docPr id="9" name="Picture 9"/>
+            <wp:cNvGraphicFramePr>
+              <a:graphicFrameLocks noChangeAspect="1"/>
+            </wp:cNvGraphicFramePr>
+            <a:graphic>
+              <a:graphicData uri="http://schemas.openxmlformats.org/drawingml/2006/picture">
+                <pic:pic>
+                  <pic:nvPicPr>
+                    <pic:cNvPr id="0" name="06-share-links.png"/>
+                    <pic:cNvPicPr/>
+                  </pic:nvPicPr>
+                  <pic:blipFill>
+                    <a:blip r:embed="rId17"/>
+                    <a:stretch>
+                      <a:fillRect/>
+                    </a:stretch>
+                  </pic:blipFill>
+                  <pic:spPr>
+                    <a:xfrm>
+                      <a:off x="0" y="0"/>
+                      <a:ext cx="4680000" cy="4877053"/>
+                    </a:xfrm>
+                    <a:prstGeom prst="rect"/>
+                  </pic:spPr>
+                </pic:pic>
+              </a:graphicData>
+            </a:graphic>
+          </wp:inline>
+        </w:drawing>
+      </w:r>
+    </w:p>
+    <w:p>
+      <w:pPr>
+        <w:spacing w:after="160" w:before="0"/>
+        <w:bidi/>
+        <w:jc w:val="center"/>
+      </w:pPr>
+      <w:r>
+        <w:rPr>
+          <w:rFonts w:ascii="Sakkal Majalla" w:hAnsi="Sakkal Majalla" w:cs="Sakkal Majalla" w:eastAsia="Sakkal Majalla"/>
+          <w:b w:val="0"/>
+          <w:color w:val="666666"/>
+          <w:sz w:val="24"/>
+          <w:szCs w:val="24"/>
+        </w:rPr>
+        <w:t>عبارة «تم الربط» في الأعلى، ثم روابط الأعضاء ورابط الرئيس</w:t>
+      </w:r>
+    </w:p>
+    <w:p>
+      <w:pPr>
+        <w:spacing w:after="60" w:before="200"/>
+        <w:bidi/>
+        <w:jc w:val="right"/>
+      </w:pPr>
+      <w:r>
+        <w:rPr>
+          <w:rFonts w:ascii="Sakkal Majalla" w:hAnsi="Sakkal Majalla" w:cs="Sakkal Majalla" w:eastAsia="Sakkal Majalla"/>
+          <w:b/>
+          <w:color w:val="0D6B63"/>
+          <w:sz w:val="34"/>
+          <w:bCs/>
+          <w:szCs w:val="34"/>
+        </w:rPr>
+        <w:t>الخطوة 5: بوابة الشواهد الخاصة بك</w:t>
+      </w:r>
+    </w:p>
+    <w:p>
+      <w:pPr>
+        <w:spacing w:after="60" w:before="0"/>
+        <w:bidi/>
+        <w:jc w:val="right"/>
+      </w:pPr>
+      <w:r>
+        <w:rPr>
+          <w:rFonts w:ascii="Sakkal Majalla" w:hAnsi="Sakkal Majalla" w:cs="Sakkal Majalla" w:eastAsia="Sakkal Majalla"/>
+          <w:b w:val="0"/>
+          <w:sz w:val="28"/>
+          <w:szCs w:val="28"/>
+        </w:rPr>
+        <w:t>البوابة تستقبل شواهد المنشأة في مجلد Drive في حسابك. افتح تبويب «طلب الشواهد من المنشأة»، ثم «إنشاء بوابة الشواهد الخاصة بي»، واضغط «نسخ كود البوابة».</w:t>
+      </w:r>
+    </w:p>
+    <w:p>
+      <w:pPr>
+        <w:spacing w:after="40"/>
+        <w:jc w:val="center"/>
+      </w:pPr>
+      <w:r>
+        <w:drawing>
+          <wp:inline xmlns:a="http://schemas.openxmlformats.org/drawingml/2006/main" xmlns:pic="http://schemas.openxmlformats.org/drawingml/2006/picture">
+            <wp:extent cx="5400000" cy="2964706"/>
+            <wp:docPr id="10" name="Picture 10"/>
+            <wp:cNvGraphicFramePr>
+              <a:graphicFrameLocks noChangeAspect="1"/>
+            </wp:cNvGraphicFramePr>
+            <a:graphic>
+              <a:graphicData uri="http://schemas.openxmlformats.org/drawingml/2006/picture">
+                <pic:pic>
+                  <pic:nvPicPr>
+                    <pic:cNvPr id="0" name="07-portal-panel.png"/>
+                    <pic:cNvPicPr/>
+                  </pic:nvPicPr>
+                  <pic:blipFill>
+                    <a:blip r:embed="rId18"/>
+                    <a:stretch>
+                      <a:fillRect/>
+                    </a:stretch>
+                  </pic:blipFill>
+                  <pic:spPr>
+                    <a:xfrm>
+                      <a:off x="0" y="0"/>
+                      <a:ext cx="5400000" cy="2964706"/>
+                    </a:xfrm>
+                    <a:prstGeom prst="rect"/>
+                  </pic:spPr>
+                </pic:pic>
+              </a:graphicData>
+            </a:graphic>
+          </wp:inline>
+        </w:drawing>
+      </w:r>
+    </w:p>
+    <w:p>
+      <w:pPr>
+        <w:spacing w:after="160" w:before="0"/>
+        <w:bidi/>
+        <w:jc w:val="center"/>
+      </w:pPr>
+      <w:r>
+        <w:rPr>
+          <w:rFonts w:ascii="Sakkal Majalla" w:hAnsi="Sakkal Majalla" w:cs="Sakkal Majalla" w:eastAsia="Sakkal Majalla"/>
+          <w:b w:val="0"/>
+          <w:color w:val="666666"/>
+          <w:sz w:val="24"/>
+          <w:szCs w:val="24"/>
+        </w:rPr>
+        <w:t>قسم إنشاء البوابة وكودها</w:t>
+      </w:r>
+    </w:p>
+    <w:p>
+      <w:pPr>
+        <w:spacing w:after="60" w:before="0"/>
+        <w:bidi/>
+        <w:jc w:val="right"/>
+      </w:pPr>
+      <w:r>
+        <w:rPr>
+          <w:rFonts w:ascii="Sakkal Majalla" w:hAnsi="Sakkal Majalla" w:cs="Sakkal Majalla" w:eastAsia="Sakkal Majalla"/>
+          <w:b w:val="0"/>
+          <w:sz w:val="28"/>
+          <w:szCs w:val="28"/>
+        </w:rPr>
+        <w:t>افتح script.new جديدًا غير مشروع الجدول، والصق كود البوابة واحفظ، وشغّل setup ووافق على الصلاحيات كما في الخطوة 3.</w:t>
+      </w:r>
+    </w:p>
+    <w:p>
+      <w:pPr>
+        <w:spacing w:after="60" w:before="0"/>
+        <w:bidi/>
+        <w:jc w:val="right"/>
+      </w:pPr>
+      <w:r>
+        <w:rPr>
+          <w:rFonts w:ascii="Sakkal Majalla" w:hAnsi="Sakkal Majalla" w:cs="Sakkal Majalla" w:eastAsia="Sakkal Majalla"/>
+          <w:b w:val="0"/>
+          <w:sz w:val="28"/>
+          <w:szCs w:val="28"/>
+        </w:rPr>
+        <w:t>بعد التشغيل افتح سجل التنفيذ أسفل المحرر، وانسخ كلمة سر الفريق في البوابة.</w:t>
+      </w:r>
+    </w:p>
+    <w:p>
+      <w:pPr>
+        <w:spacing w:after="40"/>
+        <w:jc w:val="center"/>
+      </w:pPr>
+      <w:r>
+        <w:drawing>
+          <wp:inline xmlns:a="http://schemas.openxmlformats.org/drawingml/2006/main" xmlns:pic="http://schemas.openxmlformats.org/drawingml/2006/picture">
+            <wp:extent cx="5580000" cy="1773200"/>
+            <wp:docPr id="11" name="Picture 11"/>
+            <wp:cNvGraphicFramePr>
+              <a:graphicFrameLocks noChangeAspect="1"/>
+            </wp:cNvGraphicFramePr>
+            <a:graphic>
+              <a:graphicData uri="http://schemas.openxmlformats.org/drawingml/2006/picture">
+                <pic:pic>
+                  <pic:nvPicPr>
+                    <pic:cNvPr id="0" name="d5.png"/>
+                    <pic:cNvPicPr/>
+                  </pic:nvPicPr>
+                  <pic:blipFill>
+                    <a:blip r:embed="rId19"/>
+                    <a:stretch>
+                      <a:fillRect/>
+                    </a:stretch>
+                  </pic:blipFill>
+                  <pic:spPr>
+                    <a:xfrm>
+                      <a:off x="0" y="0"/>
+                      <a:ext cx="5580000" cy="1773200"/>
+                    </a:xfrm>
+                    <a:prstGeom prst="rect"/>
+                  </pic:spPr>
+                </pic:pic>
+              </a:graphicData>
+            </a:graphic>
+          </wp:inline>
+        </w:drawing>
+      </w:r>
+    </w:p>
+    <w:p>
+      <w:pPr>
+        <w:spacing w:after="60" w:before="0"/>
+        <w:bidi/>
+        <w:jc w:val="right"/>
+      </w:pPr>
+      <w:r>
+        <w:rPr>
+          <w:rFonts w:ascii="Sakkal Majalla" w:hAnsi="Sakkal Majalla" w:cs="Sakkal Majalla" w:eastAsia="Sakkal Majalla"/>
+          <w:b w:val="0"/>
+          <w:sz w:val="28"/>
+          <w:szCs w:val="28"/>
+        </w:rPr>
+        <w:t>انشر المشروع بالطريقة نفسها: Deploy ثم New deployment ثم Web app ثم Me ثم Anyone، وانسخ الرابط المنتهي بـ exec.</w:t>
+      </w:r>
+    </w:p>
+    <w:p>
+      <w:pPr>
+        <w:spacing w:after="60" w:before="0"/>
+        <w:bidi/>
+        <w:jc w:val="right"/>
+      </w:pPr>
+      <w:r>
+        <w:rPr>
+          <w:rFonts w:ascii="Sakkal Majalla" w:hAnsi="Sakkal Majalla" w:cs="Sakkal Majalla" w:eastAsia="Sakkal Majalla"/>
+          <w:b w:val="0"/>
+          <w:sz w:val="28"/>
+          <w:szCs w:val="28"/>
+        </w:rPr>
+        <w:t>في النموذج افتح «إعداد الربط مع البوابة»، والصق الرابط وكلمة السر، واضغط «حفظ على هذا الجهاز».</w:t>
+      </w:r>
+    </w:p>
+    <w:p>
+      <w:pPr>
+        <w:spacing w:after="40"/>
+        <w:jc w:val="center"/>
+      </w:pPr>
+      <w:r>
+        <w:drawing>
+          <wp:inline xmlns:a="http://schemas.openxmlformats.org/drawingml/2006/main" xmlns:pic="http://schemas.openxmlformats.org/drawingml/2006/picture">
+            <wp:extent cx="5400000" cy="952941"/>
+            <wp:docPr id="12" name="Picture 12"/>
+            <wp:cNvGraphicFramePr>
+              <a:graphicFrameLocks noChangeAspect="1"/>
+            </wp:cNvGraphicFramePr>
+            <a:graphic>
+              <a:graphicData uri="http://schemas.openxmlformats.org/drawingml/2006/picture">
+                <pic:pic>
+                  <pic:nvPicPr>
+                    <pic:cNvPr id="0" name="08-portal-link.png"/>
+                    <pic:cNvPicPr/>
+                  </pic:nvPicPr>
+                  <pic:blipFill>
+                    <a:blip r:embed="rId20"/>
+                    <a:stretch>
+                      <a:fillRect/>
+                    </a:stretch>
+                  </pic:blipFill>
+                  <pic:spPr>
+                    <a:xfrm>
+                      <a:off x="0" y="0"/>
+                      <a:ext cx="5400000" cy="952941"/>
+                    </a:xfrm>
+                    <a:prstGeom prst="rect"/>
+                  </pic:spPr>
+                </pic:pic>
+              </a:graphicData>
+            </a:graphic>
+          </wp:inline>
+        </w:drawing>
+      </w:r>
+    </w:p>
+    <w:p>
+      <w:pPr>
+        <w:spacing w:after="160" w:before="0"/>
+        <w:bidi/>
+        <w:jc w:val="center"/>
+      </w:pPr>
+      <w:r>
+        <w:rPr>
+          <w:rFonts w:ascii="Sakkal Majalla" w:hAnsi="Sakkal Majalla" w:cs="Sakkal Majalla" w:eastAsia="Sakkal Majalla"/>
+          <w:b w:val="0"/>
+          <w:color w:val="666666"/>
+          <w:sz w:val="24"/>
+          <w:szCs w:val="24"/>
+        </w:rPr>
+        <w:t>لصق رابط البوابة وكلمة السر</w:t>
+      </w:r>
+    </w:p>
+    <w:p>
+      <w:pPr>
+        <w:spacing w:after="60" w:before="0"/>
+        <w:bidi/>
+        <w:jc w:val="right"/>
+      </w:pPr>
+      <w:r>
+        <w:rPr>
+          <w:rFonts w:ascii="Sakkal Majalla" w:hAnsi="Sakkal Majalla" w:cs="Sakkal Majalla" w:eastAsia="Sakkal Majalla"/>
+          <w:b w:val="0"/>
+          <w:sz w:val="28"/>
+          <w:szCs w:val="28"/>
+        </w:rPr>
+        <w:t>أضف الشواهد المطلوبة في الجدول، ثم اضغط «نشر الطلب المكتبي على بوابة المنشأة». يظهر رابط المنشأة، فانسخه وأرسله لها.</w:t>
+      </w:r>
+    </w:p>
+    <w:p>
+      <w:pPr>
+        <w:spacing w:after="40"/>
+        <w:jc w:val="center"/>
+      </w:pPr>
+      <w:r>
+        <w:drawing>
+          <wp:inline xmlns:a="http://schemas.openxmlformats.org/drawingml/2006/main" xmlns:pic="http://schemas.openxmlformats.org/drawingml/2006/picture">
+            <wp:extent cx="5400000" cy="4376471"/>
+            <wp:docPr id="13" name="Picture 13"/>
+            <wp:cNvGraphicFramePr>
+              <a:graphicFrameLocks noChangeAspect="1"/>
+            </wp:cNvGraphicFramePr>
+            <a:graphic>
+              <a:graphicData uri="http://schemas.openxmlformats.org/drawingml/2006/picture">
+                <pic:pic>
+                  <pic:nvPicPr>
+                    <pic:cNvPr id="0" name="09-publish.png"/>
+                    <pic:cNvPicPr/>
+                  </pic:nvPicPr>
+                  <pic:blipFill>
+                    <a:blip r:embed="rId21"/>
+                    <a:stretch>
+                      <a:fillRect/>
+                    </a:stretch>
+                  </pic:blipFill>
+                  <pic:spPr>
+                    <a:xfrm>
+                      <a:off x="0" y="0"/>
+                      <a:ext cx="5400000" cy="4376471"/>
+                    </a:xfrm>
+                    <a:prstGeom prst="rect"/>
+                  </pic:spPr>
+                </pic:pic>
+              </a:graphicData>
+            </a:graphic>
+          </wp:inline>
+        </w:drawing>
+      </w:r>
+    </w:p>
+    <w:p>
+      <w:pPr>
+        <w:spacing w:after="160" w:before="0"/>
+        <w:bidi/>
+        <w:jc w:val="center"/>
+      </w:pPr>
+      <w:r>
+        <w:rPr>
+          <w:rFonts w:ascii="Sakkal Majalla" w:hAnsi="Sakkal Majalla" w:cs="Sakkal Majalla" w:eastAsia="Sakkal Majalla"/>
+          <w:b w:val="0"/>
+          <w:color w:val="666666"/>
+          <w:sz w:val="24"/>
+          <w:szCs w:val="24"/>
+        </w:rPr>
+        <w:t>نشر الطلب ونسخ رابط المنشأة</w:t>
+      </w:r>
+    </w:p>
+    <w:p>
+      <w:pPr>
+        <w:spacing w:after="60" w:before="200"/>
+        <w:bidi/>
+        <w:jc w:val="right"/>
+      </w:pPr>
+      <w:r>
+        <w:rPr>
+          <w:rFonts w:ascii="Sakkal Majalla" w:hAnsi="Sakkal Majalla" w:cs="Sakkal Majalla" w:eastAsia="Sakkal Majalla"/>
+          <w:b/>
+          <w:color w:val="0D6B63"/>
+          <w:sz w:val="34"/>
+          <w:bCs/>
+          <w:szCs w:val="34"/>
+        </w:rPr>
+        <w:t>عند كل زيارة جديدة</w:t>
+      </w:r>
+    </w:p>
+    <w:p>
+      <w:pPr>
+        <w:spacing w:after="60" w:before="0"/>
+        <w:bidi/>
+        <w:jc w:val="right"/>
+      </w:pPr>
+      <w:r>
+        <w:rPr>
+          <w:rFonts w:ascii="Sakkal Majalla" w:hAnsi="Sakkal Majalla" w:cs="Sakkal Majalla" w:eastAsia="Sakkal Majalla"/>
+          <w:b w:val="0"/>
+          <w:sz w:val="28"/>
+          <w:szCs w:val="28"/>
+        </w:rPr>
+        <w:t>افتح النموذج من رابط الرئيس، واضغط «بدء زيارة جديدة». تُؤرشف الزيارة السابقة في جدولك، ويُنشأ رابط جديد للفريق فتتوقف روابط الأعضاء القدامى.</w:t>
       </w:r>
     </w:p>
     <w:p>
@@ -270,12 +1206,12 @@
           <w:sz w:val="28"/>
           <w:szCs w:val="28"/>
         </w:rPr>
-        <w:t>5) الصقه في النموذج واضغط «اختبار وربط». تظهر بعدها روابط الأعضاء. أرسل لكل عضو رابطه الشخصي، واحتفظ برابط الرئيس لنفسك.</w:t>
+        <w:t>في البوابة تبدأ الزيارة الجديدة من صفحة الرئيس بمنشآتها وشواهدها وموعدها، وتبقى الزيارات السابقة محفوظة في مجلدك.</w:t>
       </w:r>
     </w:p>
     <w:p>
       <w:pPr>
-        <w:spacing w:after="40" w:before="120"/>
+        <w:spacing w:after="60" w:before="200"/>
         <w:bidi/>
         <w:jc w:val="right"/>
       </w:pPr>
@@ -284,16 +1220,16 @@
           <w:rFonts w:ascii="Sakkal Majalla" w:hAnsi="Sakkal Majalla" w:cs="Sakkal Majalla" w:eastAsia="Sakkal Majalla"/>
           <w:b/>
           <w:color w:val="0D6B63"/>
-          <w:sz w:val="32"/>
+          <w:sz w:val="34"/>
           <w:bCs/>
-          <w:szCs w:val="32"/>
+          <w:szCs w:val="34"/>
         </w:rPr>
-        <w:t>ثالثًا: بوابة الشواهد الخاصة بك (اختياري، نحو 5 دقائق)</w:t>
+        <w:t>حقوق النموذج</w:t>
       </w:r>
     </w:p>
     <w:p>
       <w:pPr>
-        <w:spacing w:after="40" w:before="0"/>
+        <w:spacing w:after="60" w:before="0"/>
         <w:bidi/>
         <w:jc w:val="right"/>
       </w:pPr>
@@ -304,12 +1240,70 @@
           <w:sz w:val="28"/>
           <w:szCs w:val="28"/>
         </w:rPr>
-        <w:t>1) في النموذج افتح تبويب «طلب الشواهد من المنشأة» ثم «إنشاء بوابة الشواهد الخاصة بي». انسخ كود البوابة.</w:t>
+        <w:t>يظهر في آخر كل صفحة شريط الإعداد وحقوق الملكية. إن عُدّل ملف النموذج يتوقف عن العمل.</w:t>
       </w:r>
     </w:p>
     <w:p>
       <w:pPr>
-        <w:spacing w:after="40" w:before="0"/>
+        <w:spacing w:after="40"/>
+        <w:jc w:val="center"/>
+      </w:pPr>
+      <w:r>
+        <w:drawing>
+          <wp:inline xmlns:a="http://schemas.openxmlformats.org/drawingml/2006/main" xmlns:pic="http://schemas.openxmlformats.org/drawingml/2006/picture">
+            <wp:extent cx="5760000" cy="247680"/>
+            <wp:docPr id="14" name="Picture 14"/>
+            <wp:cNvGraphicFramePr>
+              <a:graphicFrameLocks noChangeAspect="1"/>
+            </wp:cNvGraphicFramePr>
+            <a:graphic>
+              <a:graphicData uri="http://schemas.openxmlformats.org/drawingml/2006/picture">
+                <pic:pic>
+                  <pic:nvPicPr>
+                    <pic:cNvPr id="0" name="10-rights.png"/>
+                    <pic:cNvPicPr/>
+                  </pic:nvPicPr>
+                  <pic:blipFill>
+                    <a:blip r:embed="rId22"/>
+                    <a:stretch>
+                      <a:fillRect/>
+                    </a:stretch>
+                  </pic:blipFill>
+                  <pic:spPr>
+                    <a:xfrm>
+                      <a:off x="0" y="0"/>
+                      <a:ext cx="5760000" cy="247680"/>
+                    </a:xfrm>
+                    <a:prstGeom prst="rect"/>
+                  </pic:spPr>
+                </pic:pic>
+              </a:graphicData>
+            </a:graphic>
+          </wp:inline>
+        </w:drawing>
+      </w:r>
+    </w:p>
+    <w:p>
+      <w:pPr>
+        <w:spacing w:after="60" w:before="200"/>
+        <w:bidi/>
+        <w:jc w:val="right"/>
+      </w:pPr>
+      <w:r>
+        <w:rPr>
+          <w:rFonts w:ascii="Sakkal Majalla" w:hAnsi="Sakkal Majalla" w:cs="Sakkal Majalla" w:eastAsia="Sakkal Majalla"/>
+          <w:b/>
+          <w:color w:val="0D6B63"/>
+          <w:sz w:val="34"/>
+          <w:bCs/>
+          <w:szCs w:val="34"/>
+        </w:rPr>
+        <w:t>للتواصل والاقتراحات</w:t>
+      </w:r>
+    </w:p>
+    <w:p>
+      <w:pPr>
+        <w:spacing w:after="60" w:before="0"/>
         <w:bidi/>
         <w:jc w:val="right"/>
       </w:pPr>
@@ -320,12 +1314,31 @@
           <w:sz w:val="28"/>
           <w:szCs w:val="28"/>
         </w:rPr>
-        <w:t>2) افتح script.new جديدًا، والصق الكود، ثم احفظ، ونفّذ الدالة setup ووافق على الصلاحيات.</w:t>
+        <w:t>يسعدني وصول ملاحظاتك واقتراحاتك على البريد:</w:t>
       </w:r>
     </w:p>
     <w:p>
       <w:pPr>
-        <w:spacing w:after="40" w:before="0"/>
+        <w:spacing w:after="80" w:before="0"/>
+        <w:bidi/>
+        <w:jc w:val="right"/>
+      </w:pPr>
+      <w:r>
+        <w:rPr>
+          <w:rFonts w:ascii="Sakkal Majalla" w:hAnsi="Sakkal Majalla" w:cs="Sakkal Majalla" w:eastAsia="Sakkal Majalla"/>
+          <w:b/>
+          <w:color w:val="0D6B63"/>
+          <w:sz w:val="28"/>
+          <w:bCs/>
+          <w:szCs w:val="28"/>
+          <w:rtl w:val="0"/>
+        </w:rPr>
+        <w:t>alrabia02@gmail.com</w:t>
+      </w:r>
+    </w:p>
+    <w:p>
+      <w:pPr>
+        <w:spacing w:after="60" w:before="0"/>
         <w:bidi/>
         <w:jc w:val="right"/>
       </w:pPr>
@@ -336,44 +1349,12 @@
           <w:sz w:val="28"/>
           <w:szCs w:val="28"/>
         </w:rPr>
-        <w:t>3) افتح سجل التنفيذ في أسفل المحرر وانسخ «كلمة سر الفريق في البوابة». تنشئ الدالة أيضًا مجلد «بوابة شواهد المنشآت» في Drive الخاص بك.</w:t>
+        <w:t>وأرجو ألا تنساني ووالديّ وأهلي وولدي من صالح دعائك.</w:t>
       </w:r>
     </w:p>
     <w:p>
       <w:pPr>
-        <w:spacing w:after="40" w:before="0"/>
-        <w:bidi/>
-        <w:jc w:val="right"/>
-      </w:pPr>
-      <w:r>
-        <w:rPr>
-          <w:rFonts w:ascii="Sakkal Majalla" w:hAnsi="Sakkal Majalla" w:cs="Sakkal Majalla" w:eastAsia="Sakkal Majalla"/>
-          <w:b w:val="0"/>
-          <w:sz w:val="28"/>
-          <w:szCs w:val="28"/>
-        </w:rPr>
-        <w:t>4) اضغط «نشر» ثم «عملية نشر جديدة»، «تطبيق ويب»، «أنا»، «أي شخص»، وانسخ الرابط المنتهي بـ exec.</w:t>
-      </w:r>
-    </w:p>
-    <w:p>
-      <w:pPr>
-        <w:spacing w:after="120" w:before="0"/>
-        <w:bidi/>
-        <w:jc w:val="right"/>
-      </w:pPr>
-      <w:r>
-        <w:rPr>
-          <w:rFonts w:ascii="Sakkal Majalla" w:hAnsi="Sakkal Majalla" w:cs="Sakkal Majalla" w:eastAsia="Sakkal Majalla"/>
-          <w:b w:val="0"/>
-          <w:sz w:val="28"/>
-          <w:szCs w:val="28"/>
-        </w:rPr>
-        <w:t>5) في النموذج افتح «إعداد الربط مع البوابة»، والصق الرابط وكلمة السر، واضغط «حفظ على هذا الجهاز». بعدها يمكنك نشر الطلب على المنشأة وإرسال رابطها.</w:t>
-      </w:r>
-    </w:p>
-    <w:p>
-      <w:pPr>
-        <w:spacing w:after="40" w:before="120"/>
+        <w:spacing w:after="0" w:before="0"/>
         <w:bidi/>
         <w:jc w:val="right"/>
       </w:pPr>
@@ -381,95 +1362,12 @@
         <w:rPr>
           <w:rFonts w:ascii="Sakkal Majalla" w:hAnsi="Sakkal Majalla" w:cs="Sakkal Majalla" w:eastAsia="Sakkal Majalla"/>
           <w:b/>
-          <w:color w:val="0D6B63"/>
-          <w:sz w:val="32"/>
+          <w:color w:val="8A6D1D"/>
+          <w:sz w:val="28"/>
           <w:bCs/>
-          <w:szCs w:val="32"/>
-        </w:rPr>
-        <w:t>عند كل زيارة جديدة</w:t>
-      </w:r>
-    </w:p>
-    <w:p>
-      <w:pPr>
-        <w:spacing w:after="120" w:before="0"/>
-        <w:bidi/>
-        <w:jc w:val="right"/>
-      </w:pPr>
-      <w:r>
-        <w:rPr>
-          <w:rFonts w:ascii="Sakkal Majalla" w:hAnsi="Sakkal Majalla" w:cs="Sakkal Majalla" w:eastAsia="Sakkal Majalla"/>
-          <w:b w:val="0"/>
-          <w:sz w:val="28"/>
           <w:szCs w:val="28"/>
         </w:rPr>
-        <w:t>من رابط الرئيس اضغط «بدء زيارة جديدة» في النموذج، فتُؤرشف الزيارة السابقة ويُنشأ رابط جديد للفريق. وللبوابة زر «زيارة جديدة» خاص بها بمنشآتها وشواهدها وموعدها.</w:t>
-      </w:r>
-    </w:p>
-    <w:p>
-      <w:pPr>
-        <w:spacing w:after="40" w:before="120"/>
-        <w:bidi/>
-        <w:jc w:val="right"/>
-      </w:pPr>
-      <w:r>
-        <w:rPr>
-          <w:rFonts w:ascii="Sakkal Majalla" w:hAnsi="Sakkal Majalla" w:cs="Sakkal Majalla" w:eastAsia="Sakkal Majalla"/>
-          <w:b/>
-          <w:color w:val="0D6B63"/>
-          <w:sz w:val="32"/>
-          <w:bCs/>
-          <w:szCs w:val="32"/>
-        </w:rPr>
-        <w:t>الروابط المستخدمة</w:t>
-      </w:r>
-    </w:p>
-    <w:p>
-      <w:pPr>
-        <w:spacing w:after="20" w:before="0"/>
-        <w:bidi/>
-        <w:jc w:val="right"/>
-      </w:pPr>
-      <w:r>
-        <w:rPr>
-          <w:rFonts w:ascii="Sakkal Majalla" w:hAnsi="Sakkal Majalla" w:cs="Sakkal Majalla" w:eastAsia="Sakkal Majalla"/>
-          <w:b w:val="0"/>
-          <w:sz w:val="26"/>
-          <w:szCs w:val="26"/>
-        </w:rPr>
-        <w:t>رابط النموذج: ali-alahmari.github.io/forms/22m-share</w:t>
-      </w:r>
-    </w:p>
-    <w:p>
-      <w:pPr>
-        <w:spacing w:after="20" w:before="0"/>
-        <w:bidi/>
-        <w:jc w:val="right"/>
-      </w:pPr>
-      <w:r>
-        <w:rPr>
-          <w:rFonts w:ascii="Sakkal Majalla" w:hAnsi="Sakkal Majalla" w:cs="Sakkal Majalla" w:eastAsia="Sakkal Majalla"/>
-          <w:b w:val="0"/>
-          <w:sz w:val="26"/>
-          <w:szCs w:val="26"/>
-        </w:rPr>
-        <w:t>محرر Apps Script جديد: script.new</w:t>
-      </w:r>
-    </w:p>
-    <w:p>
-      <w:pPr>
-        <w:spacing w:after="0" w:before="120"/>
-        <w:bidi/>
-        <w:jc w:val="right"/>
-      </w:pPr>
-      <w:r>
-        <w:rPr>
-          <w:rFonts w:ascii="Sakkal Majalla" w:hAnsi="Sakkal Majalla" w:cs="Sakkal Majalla" w:eastAsia="Sakkal Majalla"/>
-          <w:b w:val="0"/>
-          <w:color w:val="555555"/>
-          <w:sz w:val="26"/>
-          <w:szCs w:val="26"/>
-        </w:rPr>
-        <w:t>ملاحظة: صفحات المنشأة والفريق في البوابة تُفتح من صفحة جاهزة مستضافة، وتُحفظ بياناتها في Drive الخاص بك وحدك.</w:t>
+        <w:t>أخوك المهندس/ علي الأحمري</w:t>
       </w:r>
     </w:p>
     <w:sectPr>

</xml_diff>